<commit_message>
Add Pauli noise simulation
</commit_message>
<xml_diff>
--- a/QuantumSim Evo.docx
+++ b/QuantumSim Evo.docx
@@ -2,6 +2,17 @@
 <file path=word/document.xml><?xml version="1.0" encoding="utf-8"?>
 <w:document xmlns:wpc="http://schemas.microsoft.com/office/word/2010/wordprocessingCanvas" xmlns:cx="http://schemas.microsoft.com/office/drawing/2014/chartex" xmlns:cx1="http://schemas.microsoft.com/office/drawing/2015/9/8/chartex" xmlns:cx2="http://schemas.microsoft.com/office/drawing/2015/10/21/chartex" xmlns:cx3="http://schemas.microsoft.com/office/drawing/2016/5/9/chartex" xmlns:cx4="http://schemas.microsoft.com/office/drawing/2016/5/10/chartex" xmlns:cx5="http://schemas.microsoft.com/office/drawing/2016/5/11/chartex" xmlns:cx6="http://schemas.microsoft.com/office/drawing/2016/5/12/chartex" xmlns:cx7="http://schemas.microsoft.com/office/drawing/2016/5/13/chartex" xmlns:cx8="http://schemas.microsoft.com/office/drawing/2016/5/14/chartex" xmlns:mc="http://schemas.openxmlformats.org/markup-compatibility/2006" xmlns:aink="http://schemas.microsoft.com/office/drawing/2016/ink" xmlns:am3d="http://schemas.microsoft.com/office/drawing/2017/model3d" xmlns:o="urn:schemas-microsoft-com:office:office" xmlns:r="http://schemas.openxmlformats.org/officeDocument/2006/relationships" xmlns:m="http://schemas.openxmlformats.org/officeDocument/2006/math" xmlns:v="urn:schemas-microsoft-com:vml" xmlns:wp14="http://schemas.microsoft.com/office/word/2010/wordprocessingDrawing" xmlns:wp="http://schemas.openxmlformats.org/drawingml/2006/wordprocessingDrawing" xmlns:w10="urn:schemas-microsoft-com:office:word" xmlns:w="http://schemas.openxmlformats.org/wordprocessingml/2006/main" xmlns:w14="http://schemas.microsoft.com/office/word/2010/wordml" xmlns:w15="http://schemas.microsoft.com/office/word/2012/wordml" xmlns:w16cex="http://schemas.microsoft.com/office/word/2018/wordml/cex" xmlns:w16cid="http://schemas.microsoft.com/office/word/2016/wordml/cid" xmlns:w16="http://schemas.microsoft.com/office/word/2018/wordml" xmlns:w16sdtdh="http://schemas.microsoft.com/office/word/2020/wordml/sdtdatahash" xmlns:w16se="http://schemas.microsoft.com/office/word/2015/wordml/symex" xmlns:wpg="http://schemas.microsoft.com/office/word/2010/wordprocessingGroup" xmlns:wpi="http://schemas.microsoft.com/office/word/2010/wordprocessingInk" xmlns:wne="http://schemas.microsoft.com/office/word/2006/wordml" xmlns:wps="http://schemas.microsoft.com/office/word/2010/wordprocessingShape" mc:Ignorable="w14 w15 w16se w16cid w16 w16cex w16sdtdh wp14">
   <w:body>
+    <w:p>
+      <w:pPr>
+        <w:pStyle w:val="Heading1"/>
+        <w:jc w:val="center"/>
+        <w:rPr>
+          <w:b/>
+          <w:bCs/>
+          <w:lang w:val="en-US"/>
+        </w:rPr>
+      </w:pPr>
+    </w:p>
     <w:p>
       <w:pPr>
         <w:pStyle w:val="Heading1"/>
@@ -916,6 +927,7 @@
         </w:rPr>
       </w:pPr>
       <w:r>
+        <w:lastRenderedPageBreak/>
         <w:t>qubit reordering</w:t>
       </w:r>
     </w:p>
@@ -947,7 +959,6 @@
         <w:rPr>
           <w:lang w:val="en-US"/>
         </w:rPr>
-        <w:lastRenderedPageBreak/>
         <w:t>23/02/2026</w:t>
       </w:r>
     </w:p>
@@ -1714,6 +1725,470 @@
         <w:t>Look in memory optimization – matrix rank reduction – should be an library</w:t>
       </w:r>
     </w:p>
+    <w:p>
+      <w:pPr>
+        <w:rPr>
+          <w:lang w:val="en-US"/>
+        </w:rPr>
+      </w:pPr>
+    </w:p>
+    <w:p>
+      <w:pPr>
+        <w:pStyle w:val="Heading2"/>
+        <w:rPr>
+          <w:lang w:val="en-US"/>
+        </w:rPr>
+      </w:pPr>
+      <w:r>
+        <w:rPr>
+          <w:lang w:val="ru-RU"/>
+        </w:rPr>
+        <w:t>14</w:t>
+      </w:r>
+      <w:r>
+        <w:rPr>
+          <w:lang w:val="en-US"/>
+        </w:rPr>
+        <w:t>/03/2026</w:t>
+      </w:r>
+    </w:p>
+    <w:p>
+      <w:pPr>
+        <w:pStyle w:val="ListParagraph"/>
+        <w:numPr>
+          <w:ilvl w:val="0"/>
+          <w:numId w:val="13"/>
+        </w:numPr>
+        <w:rPr>
+          <w:lang w:val="en-US"/>
+        </w:rPr>
+      </w:pPr>
+      <w:r>
+        <w:rPr>
+          <w:lang w:val="en-US"/>
+        </w:rPr>
+        <w:t>Add AVX2 methods for PauliX and RotateX</w:t>
+      </w:r>
+    </w:p>
+    <w:p>
+      <w:pPr>
+        <w:pStyle w:val="ListParagraph"/>
+        <w:numPr>
+          <w:ilvl w:val="0"/>
+          <w:numId w:val="13"/>
+        </w:numPr>
+        <w:rPr>
+          <w:lang w:val="en-US"/>
+        </w:rPr>
+      </w:pPr>
+      <w:r>
+        <w:rPr>
+          <w:lang w:val="en-US"/>
+        </w:rPr>
+        <w:t>Add auto detect AVX2 Support</w:t>
+      </w:r>
+      <w:r>
+        <w:rPr>
+          <w:lang w:val="en-US"/>
+        </w:rPr>
+        <w:t>:</w:t>
+      </w:r>
+    </w:p>
+    <w:p>
+      <w:pPr>
+        <w:pStyle w:val="ListParagraph"/>
+        <w:numPr>
+          <w:ilvl w:val="1"/>
+          <w:numId w:val="13"/>
+        </w:numPr>
+        <w:rPr>
+          <w:lang w:val="en-US"/>
+        </w:rPr>
+      </w:pPr>
+      <w:r>
+        <w:rPr>
+          <w:lang w:val="en-US"/>
+        </w:rPr>
+        <w:t>Now there is a factory class for CircuitUnitaryOperations</w:t>
+      </w:r>
+      <w:r>
+        <w:rPr>
+          <w:lang w:val="en-US"/>
+        </w:rPr>
+        <w:t>, that on creating detect if AVX2 can be supported</w:t>
+      </w:r>
+    </w:p>
+    <w:p>
+      <w:pPr>
+        <w:pStyle w:val="ListParagraph"/>
+        <w:numPr>
+          <w:ilvl w:val="1"/>
+          <w:numId w:val="13"/>
+        </w:numPr>
+        <w:rPr>
+          <w:lang w:val="en-US"/>
+        </w:rPr>
+      </w:pPr>
+      <w:r>
+        <w:rPr>
+          <w:lang w:val="en-US"/>
+        </w:rPr>
+        <w:t>AVX2 methods moved to new class</w:t>
+      </w:r>
+    </w:p>
+    <w:p>
+      <w:pPr>
+        <w:rPr>
+          <w:b/>
+          <w:bCs/>
+          <w:lang w:val="en-US"/>
+        </w:rPr>
+      </w:pPr>
+      <w:r>
+        <w:rPr>
+          <w:b/>
+          <w:bCs/>
+          <w:lang w:val="en-US"/>
+        </w:rPr>
+        <w:t>Benchmark for AVX2 30 qubits:</w:t>
+      </w:r>
+      <w:r>
+        <w:rPr>
+          <w:b/>
+          <w:bCs/>
+          <w:lang w:val="en-US"/>
+        </w:rPr>
+        <w:t xml:space="preserve"> </w:t>
+      </w:r>
+    </w:p>
+    <w:p>
+      <w:pPr>
+        <w:rPr>
+          <w:b/>
+          <w:bCs/>
+          <w:lang w:val="en-US"/>
+        </w:rPr>
+      </w:pPr>
+      <w:r>
+        <w:rPr>
+          <w:b/>
+          <w:bCs/>
+          <w:noProof/>
+          <w:lang w:val="en-US"/>
+        </w:rPr>
+        <w:drawing>
+          <wp:inline distT="0" distB="0" distL="0" distR="0" wp14:anchorId="15EE3A58" wp14:editId="6F4108EC">
+            <wp:extent cx="3820058" cy="1800476"/>
+            <wp:effectExtent l="0" t="0" r="9525" b="9525"/>
+            <wp:docPr id="2" name="Picture 2"/>
+            <wp:cNvGraphicFramePr>
+              <a:graphicFrameLocks xmlns:a="http://schemas.openxmlformats.org/drawingml/2006/main" noChangeAspect="1"/>
+            </wp:cNvGraphicFramePr>
+            <a:graphic xmlns:a="http://schemas.openxmlformats.org/drawingml/2006/main">
+              <a:graphicData uri="http://schemas.openxmlformats.org/drawingml/2006/picture">
+                <pic:pic xmlns:pic="http://schemas.openxmlformats.org/drawingml/2006/picture">
+                  <pic:nvPicPr>
+                    <pic:cNvPr id="1" name=""/>
+                    <pic:cNvPicPr/>
+                  </pic:nvPicPr>
+                  <pic:blipFill>
+                    <a:blip r:embed="rId7"/>
+                    <a:stretch>
+                      <a:fillRect/>
+                    </a:stretch>
+                  </pic:blipFill>
+                  <pic:spPr>
+                    <a:xfrm>
+                      <a:off x="0" y="0"/>
+                      <a:ext cx="3820058" cy="1800476"/>
+                    </a:xfrm>
+                    <a:prstGeom prst="rect">
+                      <a:avLst/>
+                    </a:prstGeom>
+                  </pic:spPr>
+                </pic:pic>
+              </a:graphicData>
+            </a:graphic>
+          </wp:inline>
+        </w:drawing>
+      </w:r>
+    </w:p>
+    <w:p>
+      <w:pPr>
+        <w:rPr>
+          <w:b/>
+          <w:bCs/>
+          <w:lang w:val="en-US"/>
+        </w:rPr>
+      </w:pPr>
+      <w:r>
+        <w:rPr>
+          <w:b/>
+          <w:bCs/>
+          <w:lang w:val="en-US"/>
+        </w:rPr>
+        <w:t xml:space="preserve">Benchmark for AVX2 </w:t>
+      </w:r>
+      <w:r>
+        <w:rPr>
+          <w:b/>
+          <w:bCs/>
+          <w:lang w:val="en-US"/>
+        </w:rPr>
+        <w:t>29</w:t>
+      </w:r>
+      <w:r>
+        <w:rPr>
+          <w:b/>
+          <w:bCs/>
+          <w:lang w:val="en-US"/>
+        </w:rPr>
+        <w:t xml:space="preserve"> qubits: </w:t>
+      </w:r>
+    </w:p>
+    <w:p>
+      <w:pPr>
+        <w:rPr>
+          <w:b/>
+          <w:bCs/>
+          <w:lang w:val="en-US"/>
+        </w:rPr>
+      </w:pPr>
+      <w:r>
+        <w:rPr>
+          <w:b/>
+          <w:bCs/>
+          <w:noProof/>
+          <w:lang w:val="en-US"/>
+        </w:rPr>
+        <w:drawing>
+          <wp:inline distT="0" distB="0" distL="0" distR="0" wp14:anchorId="73C12797" wp14:editId="5418B295">
+            <wp:extent cx="3791479" cy="1952898"/>
+            <wp:effectExtent l="0" t="0" r="0" b="9525"/>
+            <wp:docPr id="3" name="Picture 3"/>
+            <wp:cNvGraphicFramePr>
+              <a:graphicFrameLocks xmlns:a="http://schemas.openxmlformats.org/drawingml/2006/main" noChangeAspect="1"/>
+            </wp:cNvGraphicFramePr>
+            <a:graphic xmlns:a="http://schemas.openxmlformats.org/drawingml/2006/main">
+              <a:graphicData uri="http://schemas.openxmlformats.org/drawingml/2006/picture">
+                <pic:pic xmlns:pic="http://schemas.openxmlformats.org/drawingml/2006/picture">
+                  <pic:nvPicPr>
+                    <pic:cNvPr id="1" name=""/>
+                    <pic:cNvPicPr/>
+                  </pic:nvPicPr>
+                  <pic:blipFill>
+                    <a:blip r:embed="rId8"/>
+                    <a:stretch>
+                      <a:fillRect/>
+                    </a:stretch>
+                  </pic:blipFill>
+                  <pic:spPr>
+                    <a:xfrm>
+                      <a:off x="0" y="0"/>
+                      <a:ext cx="3791479" cy="1952898"/>
+                    </a:xfrm>
+                    <a:prstGeom prst="rect">
+                      <a:avLst/>
+                    </a:prstGeom>
+                  </pic:spPr>
+                </pic:pic>
+              </a:graphicData>
+            </a:graphic>
+          </wp:inline>
+        </w:drawing>
+      </w:r>
+    </w:p>
+    <w:p>
+      <w:pPr>
+        <w:rPr>
+          <w:b/>
+          <w:bCs/>
+          <w:lang w:val="en-US"/>
+        </w:rPr>
+      </w:pPr>
+      <w:r>
+        <w:rPr>
+          <w:b/>
+          <w:bCs/>
+          <w:lang w:val="en-US"/>
+        </w:rPr>
+        <w:t>!AVX2 still missing CNOT, PauliX, Phase and RotateZ</w:t>
+      </w:r>
+    </w:p>
+    <w:p>
+      <w:pPr>
+        <w:rPr>
+          <w:lang w:val="en-US"/>
+        </w:rPr>
+      </w:pPr>
+      <w:r>
+        <w:rPr>
+          <w:lang w:val="en-US"/>
+        </w:rPr>
+        <w:lastRenderedPageBreak/>
+        <w:t>Added missing methods:</w:t>
+      </w:r>
+    </w:p>
+    <w:p>
+      <w:pPr>
+        <w:rPr>
+          <w:lang w:val="en-US"/>
+        </w:rPr>
+      </w:pPr>
+      <w:r>
+        <w:rPr>
+          <w:noProof/>
+          <w:lang w:val="en-US"/>
+        </w:rPr>
+        <w:drawing>
+          <wp:inline distT="0" distB="0" distL="0" distR="0" wp14:anchorId="40926912" wp14:editId="4BD5BEAD">
+            <wp:extent cx="3877216" cy="1762371"/>
+            <wp:effectExtent l="0" t="0" r="9525" b="9525"/>
+            <wp:docPr id="4" name="Picture 4"/>
+            <wp:cNvGraphicFramePr>
+              <a:graphicFrameLocks xmlns:a="http://schemas.openxmlformats.org/drawingml/2006/main" noChangeAspect="1"/>
+            </wp:cNvGraphicFramePr>
+            <a:graphic xmlns:a="http://schemas.openxmlformats.org/drawingml/2006/main">
+              <a:graphicData uri="http://schemas.openxmlformats.org/drawingml/2006/picture">
+                <pic:pic xmlns:pic="http://schemas.openxmlformats.org/drawingml/2006/picture">
+                  <pic:nvPicPr>
+                    <pic:cNvPr id="1" name=""/>
+                    <pic:cNvPicPr/>
+                  </pic:nvPicPr>
+                  <pic:blipFill>
+                    <a:blip r:embed="rId9"/>
+                    <a:stretch>
+                      <a:fillRect/>
+                    </a:stretch>
+                  </pic:blipFill>
+                  <pic:spPr>
+                    <a:xfrm>
+                      <a:off x="0" y="0"/>
+                      <a:ext cx="3877216" cy="1762371"/>
+                    </a:xfrm>
+                    <a:prstGeom prst="rect">
+                      <a:avLst/>
+                    </a:prstGeom>
+                  </pic:spPr>
+                </pic:pic>
+              </a:graphicData>
+            </a:graphic>
+          </wp:inline>
+        </w:drawing>
+      </w:r>
+    </w:p>
+    <w:p>
+      <w:pPr>
+        <w:rPr>
+          <w:lang w:val="en-US"/>
+        </w:rPr>
+      </w:pPr>
+    </w:p>
+    <w:p>
+      <w:pPr>
+        <w:pStyle w:val="Heading2"/>
+        <w:rPr>
+          <w:lang w:val="en-US"/>
+        </w:rPr>
+      </w:pPr>
+      <w:r>
+        <w:rPr>
+          <w:lang w:val="en-US"/>
+        </w:rPr>
+        <w:t>21/03/2026</w:t>
+      </w:r>
+    </w:p>
+    <w:p>
+      <w:pPr>
+        <w:rPr>
+          <w:lang w:val="en-US"/>
+        </w:rPr>
+      </w:pPr>
+      <w:r>
+        <w:rPr>
+          <w:lang w:val="en-US"/>
+        </w:rPr>
+        <w:t>Refine the algorithm around RotateY</w:t>
+      </w:r>
+    </w:p>
+    <w:p>
+      <w:pPr>
+        <w:rPr>
+          <w:lang w:val="en-US"/>
+        </w:rPr>
+      </w:pPr>
+      <w:r>
+        <w:rPr>
+          <w:lang w:val="en-US"/>
+        </w:rPr>
+        <w:t xml:space="preserve">Created an initial version of the document explaining the matrix calculations performed </w:t>
+      </w:r>
+    </w:p>
+    <w:p>
+      <w:pPr>
+        <w:pStyle w:val="Heading2"/>
+        <w:rPr>
+          <w:lang w:val="en-US"/>
+        </w:rPr>
+      </w:pPr>
+      <w:r>
+        <w:rPr>
+          <w:lang w:val="en-US"/>
+        </w:rPr>
+        <w:t>23/03/2026</w:t>
+      </w:r>
+    </w:p>
+    <w:p>
+      <w:pPr>
+        <w:rPr>
+          <w:lang w:val="en-US"/>
+        </w:rPr>
+      </w:pPr>
+      <w:r>
+        <w:rPr>
+          <w:lang w:val="en-US"/>
+        </w:rPr>
+        <w:t>Add the simulation of Pauli Noise - w</w:t>
+      </w:r>
+      <w:r>
+        <w:rPr>
+          <w:lang w:val="en-US"/>
+        </w:rPr>
+        <w:t>ith some chances after the gate application, the bit or phase can flip</w:t>
+      </w:r>
+      <w:r>
+        <w:rPr>
+          <w:lang w:val="en-US"/>
+        </w:rPr>
+        <w:t>.</w:t>
+      </w:r>
+    </w:p>
+    <w:p>
+      <w:pPr>
+        <w:rPr>
+          <w:lang w:val="en-US"/>
+        </w:rPr>
+      </w:pPr>
+      <w:r>
+        <w:rPr>
+          <w:lang w:val="en-US"/>
+        </w:rPr>
+        <w:t>The implementation got small impact on performance:</w:t>
+      </w:r>
+    </w:p>
+    <w:p>
+      <w:pPr>
+        <w:rPr>
+          <w:lang w:val="en-US"/>
+        </w:rPr>
+      </w:pPr>
+      <w:r>
+        <w:rPr>
+          <w:lang w:val="en-US"/>
+        </w:rPr>
+        <w:t>The worst case is PauliX * N + PauliZ * N, where N – number of qubits</w:t>
+      </w:r>
+    </w:p>
     <w:sectPr>
       <w:pgSz w:w="11906" w:h="16838"/>
       <w:pgMar w:top="1440" w:right="1440" w:bottom="1440" w:left="1440" w:header="708" w:footer="708" w:gutter="0"/>
@@ -1840,6 +2315,119 @@
     </w:lvl>
   </w:abstractNum>
   <w:abstractNum w:abstractNumId="1" w15:restartNumberingAfterBreak="0">
+    <w:nsid w:val="1F636353"/>
+    <w:multiLevelType w:val="hybridMultilevel"/>
+    <w:tmpl w:val="4C8E336E"/>
+    <w:lvl w:ilvl="0" w:tplc="20000001">
+      <w:start w:val="1"/>
+      <w:numFmt w:val="bullet"/>
+      <w:lvlText w:val=""/>
+      <w:lvlJc w:val="left"/>
+      <w:pPr>
+        <w:ind w:left="720" w:hanging="360"/>
+      </w:pPr>
+      <w:rPr>
+        <w:rFonts w:ascii="Symbol" w:hAnsi="Symbol" w:hint="default"/>
+      </w:rPr>
+    </w:lvl>
+    <w:lvl w:ilvl="1" w:tplc="20000003" w:tentative="1">
+      <w:start w:val="1"/>
+      <w:numFmt w:val="bullet"/>
+      <w:lvlText w:val="o"/>
+      <w:lvlJc w:val="left"/>
+      <w:pPr>
+        <w:ind w:left="1440" w:hanging="360"/>
+      </w:pPr>
+      <w:rPr>
+        <w:rFonts w:ascii="Courier New" w:hAnsi="Courier New" w:cs="Courier New" w:hint="default"/>
+      </w:rPr>
+    </w:lvl>
+    <w:lvl w:ilvl="2" w:tplc="20000005" w:tentative="1">
+      <w:start w:val="1"/>
+      <w:numFmt w:val="bullet"/>
+      <w:lvlText w:val=""/>
+      <w:lvlJc w:val="left"/>
+      <w:pPr>
+        <w:ind w:left="2160" w:hanging="360"/>
+      </w:pPr>
+      <w:rPr>
+        <w:rFonts w:ascii="Wingdings" w:hAnsi="Wingdings" w:hint="default"/>
+      </w:rPr>
+    </w:lvl>
+    <w:lvl w:ilvl="3" w:tplc="20000001" w:tentative="1">
+      <w:start w:val="1"/>
+      <w:numFmt w:val="bullet"/>
+      <w:lvlText w:val=""/>
+      <w:lvlJc w:val="left"/>
+      <w:pPr>
+        <w:ind w:left="2880" w:hanging="360"/>
+      </w:pPr>
+      <w:rPr>
+        <w:rFonts w:ascii="Symbol" w:hAnsi="Symbol" w:hint="default"/>
+      </w:rPr>
+    </w:lvl>
+    <w:lvl w:ilvl="4" w:tplc="20000003" w:tentative="1">
+      <w:start w:val="1"/>
+      <w:numFmt w:val="bullet"/>
+      <w:lvlText w:val="o"/>
+      <w:lvlJc w:val="left"/>
+      <w:pPr>
+        <w:ind w:left="3600" w:hanging="360"/>
+      </w:pPr>
+      <w:rPr>
+        <w:rFonts w:ascii="Courier New" w:hAnsi="Courier New" w:cs="Courier New" w:hint="default"/>
+      </w:rPr>
+    </w:lvl>
+    <w:lvl w:ilvl="5" w:tplc="20000005" w:tentative="1">
+      <w:start w:val="1"/>
+      <w:numFmt w:val="bullet"/>
+      <w:lvlText w:val=""/>
+      <w:lvlJc w:val="left"/>
+      <w:pPr>
+        <w:ind w:left="4320" w:hanging="360"/>
+      </w:pPr>
+      <w:rPr>
+        <w:rFonts w:ascii="Wingdings" w:hAnsi="Wingdings" w:hint="default"/>
+      </w:rPr>
+    </w:lvl>
+    <w:lvl w:ilvl="6" w:tplc="20000001" w:tentative="1">
+      <w:start w:val="1"/>
+      <w:numFmt w:val="bullet"/>
+      <w:lvlText w:val=""/>
+      <w:lvlJc w:val="left"/>
+      <w:pPr>
+        <w:ind w:left="5040" w:hanging="360"/>
+      </w:pPr>
+      <w:rPr>
+        <w:rFonts w:ascii="Symbol" w:hAnsi="Symbol" w:hint="default"/>
+      </w:rPr>
+    </w:lvl>
+    <w:lvl w:ilvl="7" w:tplc="20000003" w:tentative="1">
+      <w:start w:val="1"/>
+      <w:numFmt w:val="bullet"/>
+      <w:lvlText w:val="o"/>
+      <w:lvlJc w:val="left"/>
+      <w:pPr>
+        <w:ind w:left="5760" w:hanging="360"/>
+      </w:pPr>
+      <w:rPr>
+        <w:rFonts w:ascii="Courier New" w:hAnsi="Courier New" w:cs="Courier New" w:hint="default"/>
+      </w:rPr>
+    </w:lvl>
+    <w:lvl w:ilvl="8" w:tplc="20000005" w:tentative="1">
+      <w:start w:val="1"/>
+      <w:numFmt w:val="bullet"/>
+      <w:lvlText w:val=""/>
+      <w:lvlJc w:val="left"/>
+      <w:pPr>
+        <w:ind w:left="6480" w:hanging="360"/>
+      </w:pPr>
+      <w:rPr>
+        <w:rFonts w:ascii="Wingdings" w:hAnsi="Wingdings" w:hint="default"/>
+      </w:rPr>
+    </w:lvl>
+  </w:abstractNum>
+  <w:abstractNum w:abstractNumId="2" w15:restartNumberingAfterBreak="0">
     <w:nsid w:val="284B0389"/>
     <w:multiLevelType w:val="hybridMultilevel"/>
     <w:tmpl w:val="AFEEB126"/>
@@ -1952,7 +2540,120 @@
       </w:rPr>
     </w:lvl>
   </w:abstractNum>
-  <w:abstractNum w:abstractNumId="2" w15:restartNumberingAfterBreak="0">
+  <w:abstractNum w:abstractNumId="3" w15:restartNumberingAfterBreak="0">
+    <w:nsid w:val="348D545D"/>
+    <w:multiLevelType w:val="hybridMultilevel"/>
+    <w:tmpl w:val="635ADB7C"/>
+    <w:lvl w:ilvl="0" w:tplc="20000001">
+      <w:start w:val="1"/>
+      <w:numFmt w:val="bullet"/>
+      <w:lvlText w:val=""/>
+      <w:lvlJc w:val="left"/>
+      <w:pPr>
+        <w:ind w:left="720" w:hanging="360"/>
+      </w:pPr>
+      <w:rPr>
+        <w:rFonts w:ascii="Symbol" w:hAnsi="Symbol" w:hint="default"/>
+      </w:rPr>
+    </w:lvl>
+    <w:lvl w:ilvl="1" w:tplc="20000003">
+      <w:start w:val="1"/>
+      <w:numFmt w:val="bullet"/>
+      <w:lvlText w:val="o"/>
+      <w:lvlJc w:val="left"/>
+      <w:pPr>
+        <w:ind w:left="1440" w:hanging="360"/>
+      </w:pPr>
+      <w:rPr>
+        <w:rFonts w:ascii="Courier New" w:hAnsi="Courier New" w:cs="Courier New" w:hint="default"/>
+      </w:rPr>
+    </w:lvl>
+    <w:lvl w:ilvl="2" w:tplc="20000005" w:tentative="1">
+      <w:start w:val="1"/>
+      <w:numFmt w:val="bullet"/>
+      <w:lvlText w:val=""/>
+      <w:lvlJc w:val="left"/>
+      <w:pPr>
+        <w:ind w:left="2160" w:hanging="360"/>
+      </w:pPr>
+      <w:rPr>
+        <w:rFonts w:ascii="Wingdings" w:hAnsi="Wingdings" w:hint="default"/>
+      </w:rPr>
+    </w:lvl>
+    <w:lvl w:ilvl="3" w:tplc="20000001" w:tentative="1">
+      <w:start w:val="1"/>
+      <w:numFmt w:val="bullet"/>
+      <w:lvlText w:val=""/>
+      <w:lvlJc w:val="left"/>
+      <w:pPr>
+        <w:ind w:left="2880" w:hanging="360"/>
+      </w:pPr>
+      <w:rPr>
+        <w:rFonts w:ascii="Symbol" w:hAnsi="Symbol" w:hint="default"/>
+      </w:rPr>
+    </w:lvl>
+    <w:lvl w:ilvl="4" w:tplc="20000003" w:tentative="1">
+      <w:start w:val="1"/>
+      <w:numFmt w:val="bullet"/>
+      <w:lvlText w:val="o"/>
+      <w:lvlJc w:val="left"/>
+      <w:pPr>
+        <w:ind w:left="3600" w:hanging="360"/>
+      </w:pPr>
+      <w:rPr>
+        <w:rFonts w:ascii="Courier New" w:hAnsi="Courier New" w:cs="Courier New" w:hint="default"/>
+      </w:rPr>
+    </w:lvl>
+    <w:lvl w:ilvl="5" w:tplc="20000005" w:tentative="1">
+      <w:start w:val="1"/>
+      <w:numFmt w:val="bullet"/>
+      <w:lvlText w:val=""/>
+      <w:lvlJc w:val="left"/>
+      <w:pPr>
+        <w:ind w:left="4320" w:hanging="360"/>
+      </w:pPr>
+      <w:rPr>
+        <w:rFonts w:ascii="Wingdings" w:hAnsi="Wingdings" w:hint="default"/>
+      </w:rPr>
+    </w:lvl>
+    <w:lvl w:ilvl="6" w:tplc="20000001" w:tentative="1">
+      <w:start w:val="1"/>
+      <w:numFmt w:val="bullet"/>
+      <w:lvlText w:val=""/>
+      <w:lvlJc w:val="left"/>
+      <w:pPr>
+        <w:ind w:left="5040" w:hanging="360"/>
+      </w:pPr>
+      <w:rPr>
+        <w:rFonts w:ascii="Symbol" w:hAnsi="Symbol" w:hint="default"/>
+      </w:rPr>
+    </w:lvl>
+    <w:lvl w:ilvl="7" w:tplc="20000003" w:tentative="1">
+      <w:start w:val="1"/>
+      <w:numFmt w:val="bullet"/>
+      <w:lvlText w:val="o"/>
+      <w:lvlJc w:val="left"/>
+      <w:pPr>
+        <w:ind w:left="5760" w:hanging="360"/>
+      </w:pPr>
+      <w:rPr>
+        <w:rFonts w:ascii="Courier New" w:hAnsi="Courier New" w:cs="Courier New" w:hint="default"/>
+      </w:rPr>
+    </w:lvl>
+    <w:lvl w:ilvl="8" w:tplc="20000005" w:tentative="1">
+      <w:start w:val="1"/>
+      <w:numFmt w:val="bullet"/>
+      <w:lvlText w:val=""/>
+      <w:lvlJc w:val="left"/>
+      <w:pPr>
+        <w:ind w:left="6480" w:hanging="360"/>
+      </w:pPr>
+      <w:rPr>
+        <w:rFonts w:ascii="Wingdings" w:hAnsi="Wingdings" w:hint="default"/>
+      </w:rPr>
+    </w:lvl>
+  </w:abstractNum>
+  <w:abstractNum w:abstractNumId="4" w15:restartNumberingAfterBreak="0">
     <w:nsid w:val="46C47E74"/>
     <w:multiLevelType w:val="hybridMultilevel"/>
     <w:tmpl w:val="55AADDFC"/>
@@ -2065,7 +2766,7 @@
       </w:rPr>
     </w:lvl>
   </w:abstractNum>
-  <w:abstractNum w:abstractNumId="3" w15:restartNumberingAfterBreak="0">
+  <w:abstractNum w:abstractNumId="5" w15:restartNumberingAfterBreak="0">
     <w:nsid w:val="4D991DD9"/>
     <w:multiLevelType w:val="hybridMultilevel"/>
     <w:tmpl w:val="B0486BA6"/>
@@ -2178,7 +2879,7 @@
       </w:rPr>
     </w:lvl>
   </w:abstractNum>
-  <w:abstractNum w:abstractNumId="4" w15:restartNumberingAfterBreak="0">
+  <w:abstractNum w:abstractNumId="6" w15:restartNumberingAfterBreak="0">
     <w:nsid w:val="5FC96546"/>
     <w:multiLevelType w:val="hybridMultilevel"/>
     <w:tmpl w:val="DC08D184"/>
@@ -2291,7 +2992,7 @@
       </w:rPr>
     </w:lvl>
   </w:abstractNum>
-  <w:abstractNum w:abstractNumId="5" w15:restartNumberingAfterBreak="0">
+  <w:abstractNum w:abstractNumId="7" w15:restartNumberingAfterBreak="0">
     <w:nsid w:val="62964EA5"/>
     <w:multiLevelType w:val="hybridMultilevel"/>
     <w:tmpl w:val="93A25534"/>
@@ -2404,7 +3105,7 @@
       </w:rPr>
     </w:lvl>
   </w:abstractNum>
-  <w:abstractNum w:abstractNumId="6" w15:restartNumberingAfterBreak="0">
+  <w:abstractNum w:abstractNumId="8" w15:restartNumberingAfterBreak="0">
     <w:nsid w:val="639F26E0"/>
     <w:multiLevelType w:val="hybridMultilevel"/>
     <w:tmpl w:val="51CE9C50"/>
@@ -2517,7 +3218,7 @@
       </w:rPr>
     </w:lvl>
   </w:abstractNum>
-  <w:abstractNum w:abstractNumId="7" w15:restartNumberingAfterBreak="0">
+  <w:abstractNum w:abstractNumId="9" w15:restartNumberingAfterBreak="0">
     <w:nsid w:val="6CA71619"/>
     <w:multiLevelType w:val="hybridMultilevel"/>
     <w:tmpl w:val="F1A86122"/>
@@ -2630,7 +3331,7 @@
       </w:rPr>
     </w:lvl>
   </w:abstractNum>
-  <w:abstractNum w:abstractNumId="8" w15:restartNumberingAfterBreak="0">
+  <w:abstractNum w:abstractNumId="10" w15:restartNumberingAfterBreak="0">
     <w:nsid w:val="6EF50D7C"/>
     <w:multiLevelType w:val="hybridMultilevel"/>
     <w:tmpl w:val="16DE9D62"/>
@@ -2743,7 +3444,7 @@
       </w:rPr>
     </w:lvl>
   </w:abstractNum>
-  <w:abstractNum w:abstractNumId="9" w15:restartNumberingAfterBreak="0">
+  <w:abstractNum w:abstractNumId="11" w15:restartNumberingAfterBreak="0">
     <w:nsid w:val="731C569A"/>
     <w:multiLevelType w:val="hybridMultilevel"/>
     <w:tmpl w:val="27A439EE"/>
@@ -2829,7 +3530,7 @@
       </w:pPr>
     </w:lvl>
   </w:abstractNum>
-  <w:abstractNum w:abstractNumId="10" w15:restartNumberingAfterBreak="0">
+  <w:abstractNum w:abstractNumId="12" w15:restartNumberingAfterBreak="0">
     <w:nsid w:val="79601CC5"/>
     <w:multiLevelType w:val="hybridMultilevel"/>
     <w:tmpl w:val="D4B4BCAC"/>
@@ -2942,7 +3643,7 @@
       </w:rPr>
     </w:lvl>
   </w:abstractNum>
-  <w:abstractNum w:abstractNumId="11" w15:restartNumberingAfterBreak="0">
+  <w:abstractNum w:abstractNumId="13" w15:restartNumberingAfterBreak="0">
     <w:nsid w:val="7E8C1E4A"/>
     <w:multiLevelType w:val="hybridMultilevel"/>
     <w:tmpl w:val="411C4C4A"/>
@@ -3056,40 +3757,46 @@
     </w:lvl>
   </w:abstractNum>
   <w:num w:numId="1">
+    <w:abstractNumId w:val="12"/>
+  </w:num>
+  <w:num w:numId="2">
+    <w:abstractNumId w:val="9"/>
+  </w:num>
+  <w:num w:numId="3">
     <w:abstractNumId w:val="10"/>
   </w:num>
-  <w:num w:numId="2">
-    <w:abstractNumId w:val="7"/>
-  </w:num>
-  <w:num w:numId="3">
-    <w:abstractNumId w:val="8"/>
-  </w:num>
   <w:num w:numId="4">
-    <w:abstractNumId w:val="11"/>
+    <w:abstractNumId w:val="13"/>
   </w:num>
   <w:num w:numId="5">
-    <w:abstractNumId w:val="2"/>
+    <w:abstractNumId w:val="4"/>
   </w:num>
   <w:num w:numId="6">
-    <w:abstractNumId w:val="9"/>
+    <w:abstractNumId w:val="11"/>
   </w:num>
   <w:num w:numId="7">
     <w:abstractNumId w:val="0"/>
   </w:num>
   <w:num w:numId="8">
+    <w:abstractNumId w:val="5"/>
+  </w:num>
+  <w:num w:numId="9">
+    <w:abstractNumId w:val="2"/>
+  </w:num>
+  <w:num w:numId="10">
+    <w:abstractNumId w:val="8"/>
+  </w:num>
+  <w:num w:numId="11">
+    <w:abstractNumId w:val="7"/>
+  </w:num>
+  <w:num w:numId="12">
+    <w:abstractNumId w:val="6"/>
+  </w:num>
+  <w:num w:numId="13">
     <w:abstractNumId w:val="3"/>
   </w:num>
-  <w:num w:numId="9">
+  <w:num w:numId="14">
     <w:abstractNumId w:val="1"/>
-  </w:num>
-  <w:num w:numId="10">
-    <w:abstractNumId w:val="6"/>
-  </w:num>
-  <w:num w:numId="11">
-    <w:abstractNumId w:val="5"/>
-  </w:num>
-  <w:num w:numId="12">
-    <w:abstractNumId w:val="4"/>
   </w:num>
 </w:numbering>
 </file>

</xml_diff>

<commit_message>
Add QFT and Grover
</commit_message>
<xml_diff>
--- a/QuantumSim Evo.docx
+++ b/QuantumSim Evo.docx
@@ -727,7 +727,19 @@
         <w:rPr>
           <w:lang w:val="en-US"/>
         </w:rPr>
-        <w:t>Now use memory in place</w:t>
+        <w:t xml:space="preserve">Now use </w:t>
+      </w:r>
+      <w:r>
+        <w:rPr>
+          <w:lang w:val="en-US"/>
+        </w:rPr>
+        <w:t xml:space="preserve">the </w:t>
+      </w:r>
+      <w:r>
+        <w:rPr>
+          <w:lang w:val="en-US"/>
+        </w:rPr>
+        <w:t>memory in place</w:t>
       </w:r>
     </w:p>
     <w:p>
@@ -2550,11 +2562,692 @@
           <w:lang w:val="en-US"/>
         </w:rPr>
       </w:pPr>
-      <w:r>
-        <w:rPr>
-          <w:lang w:val="en-US"/>
-        </w:rPr>
-        <w:t>https://quantum-journal.org/papers/q-2018-09-03-88/pdf/</w:t>
+      <w:hyperlink r:id="rId11" w:history="1">
+        <w:r>
+          <w:rPr>
+            <w:rStyle w:val="Hyperlink"/>
+            <w:lang w:val="en-US"/>
+          </w:rPr>
+          <w:t>https://quantum-journal.org/papers/q-2018-09-03-88/pdf/</w:t>
+        </w:r>
+      </w:hyperlink>
+    </w:p>
+    <w:p>
+      <w:pPr>
+        <w:pStyle w:val="Heading2"/>
+        <w:rPr>
+          <w:lang w:val="en-US"/>
+        </w:rPr>
+      </w:pPr>
+      <w:r>
+        <w:rPr>
+          <w:lang w:val="en-US"/>
+        </w:rPr>
+        <w:t>3-5/05/2026</w:t>
+      </w:r>
+    </w:p>
+    <w:p>
+      <w:pPr>
+        <w:rPr>
+          <w:lang w:val="en-US"/>
+        </w:rPr>
+      </w:pPr>
+      <w:r>
+        <w:rPr>
+          <w:lang w:val="en-US"/>
+        </w:rPr>
+        <w:t>Added QAOA algorithm for 30 nodes.</w:t>
+      </w:r>
+    </w:p>
+    <w:p>
+      <w:pPr>
+        <w:rPr>
+          <w:lang w:val="en-US"/>
+        </w:rPr>
+      </w:pPr>
+      <w:r>
+        <w:rPr>
+          <w:lang w:val="en-US"/>
+        </w:rPr>
+        <w:t>First run:</w:t>
+      </w:r>
+    </w:p>
+    <w:p>
+      <w:pPr>
+        <w:rPr>
+          <w:lang w:val="en-US"/>
+        </w:rPr>
+      </w:pPr>
+      <w:r>
+        <w:rPr>
+          <w:noProof/>
+          <w:lang w:val="en-US"/>
+        </w:rPr>
+        <w:drawing>
+          <wp:inline distT="0" distB="0" distL="0" distR="0" wp14:anchorId="10FE07E6" wp14:editId="7C81BBDF">
+            <wp:extent cx="5601482" cy="1009791"/>
+            <wp:effectExtent l="0" t="0" r="0" b="0"/>
+            <wp:docPr id="6" name="Picture 6"/>
+            <wp:cNvGraphicFramePr>
+              <a:graphicFrameLocks xmlns:a="http://schemas.openxmlformats.org/drawingml/2006/main" noChangeAspect="1"/>
+            </wp:cNvGraphicFramePr>
+            <a:graphic xmlns:a="http://schemas.openxmlformats.org/drawingml/2006/main">
+              <a:graphicData uri="http://schemas.openxmlformats.org/drawingml/2006/picture">
+                <pic:pic xmlns:pic="http://schemas.openxmlformats.org/drawingml/2006/picture">
+                  <pic:nvPicPr>
+                    <pic:cNvPr id="1" name=""/>
+                    <pic:cNvPicPr/>
+                  </pic:nvPicPr>
+                  <pic:blipFill>
+                    <a:blip r:embed="rId12"/>
+                    <a:stretch>
+                      <a:fillRect/>
+                    </a:stretch>
+                  </pic:blipFill>
+                  <pic:spPr>
+                    <a:xfrm>
+                      <a:off x="0" y="0"/>
+                      <a:ext cx="5601482" cy="1009791"/>
+                    </a:xfrm>
+                    <a:prstGeom prst="rect">
+                      <a:avLst/>
+                    </a:prstGeom>
+                  </pic:spPr>
+                </pic:pic>
+              </a:graphicData>
+            </a:graphic>
+          </wp:inline>
+        </w:drawing>
+      </w:r>
+    </w:p>
+    <w:p>
+      <w:pPr>
+        <w:pStyle w:val="Quote"/>
+        <w:rPr>
+          <w:lang w:val="en-US"/>
+        </w:rPr>
+      </w:pPr>
+      <w:r>
+        <w:rPr>
+          <w:lang w:val="en-US"/>
+        </w:rPr>
+        <w:t>Description: 30 nodes, 3 layers, gamma 3*pi/8, beta 3*pi/3, samples 70000</w:t>
+      </w:r>
+    </w:p>
+    <w:p>
+      <w:pPr>
+        <w:rPr>
+          <w:lang w:val="en-US"/>
+        </w:rPr>
+      </w:pPr>
+      <w:r>
+        <w:rPr>
+          <w:lang w:val="en-US"/>
+        </w:rPr>
+        <w:t>Second run:</w:t>
+      </w:r>
+    </w:p>
+    <w:p>
+      <w:pPr>
+        <w:rPr>
+          <w:lang w:val="en-US"/>
+        </w:rPr>
+      </w:pPr>
+      <w:r>
+        <w:rPr>
+          <w:noProof/>
+          <w:lang w:val="en-US"/>
+        </w:rPr>
+        <w:lastRenderedPageBreak/>
+        <w:drawing>
+          <wp:inline distT="0" distB="0" distL="0" distR="0" wp14:anchorId="6984AB67" wp14:editId="21B08123">
+            <wp:extent cx="5153744" cy="1200318"/>
+            <wp:effectExtent l="0" t="0" r="0" b="0"/>
+            <wp:docPr id="7" name="Picture 7"/>
+            <wp:cNvGraphicFramePr>
+              <a:graphicFrameLocks xmlns:a="http://schemas.openxmlformats.org/drawingml/2006/main" noChangeAspect="1"/>
+            </wp:cNvGraphicFramePr>
+            <a:graphic xmlns:a="http://schemas.openxmlformats.org/drawingml/2006/main">
+              <a:graphicData uri="http://schemas.openxmlformats.org/drawingml/2006/picture">
+                <pic:pic xmlns:pic="http://schemas.openxmlformats.org/drawingml/2006/picture">
+                  <pic:nvPicPr>
+                    <pic:cNvPr id="1" name=""/>
+                    <pic:cNvPicPr/>
+                  </pic:nvPicPr>
+                  <pic:blipFill>
+                    <a:blip r:embed="rId13"/>
+                    <a:stretch>
+                      <a:fillRect/>
+                    </a:stretch>
+                  </pic:blipFill>
+                  <pic:spPr>
+                    <a:xfrm>
+                      <a:off x="0" y="0"/>
+                      <a:ext cx="5153744" cy="1200318"/>
+                    </a:xfrm>
+                    <a:prstGeom prst="rect">
+                      <a:avLst/>
+                    </a:prstGeom>
+                  </pic:spPr>
+                </pic:pic>
+              </a:graphicData>
+            </a:graphic>
+          </wp:inline>
+        </w:drawing>
+      </w:r>
+    </w:p>
+    <w:p>
+      <w:pPr>
+        <w:pStyle w:val="Quote"/>
+        <w:rPr>
+          <w:lang w:val="en-US"/>
+        </w:rPr>
+      </w:pPr>
+      <w:r>
+        <w:rPr>
+          <w:lang w:val="en-US"/>
+        </w:rPr>
+        <w:t>Description: 30 nodes, 3 layers, gamma 3*pi/8, beta 3*pi/3, samples 150000</w:t>
+      </w:r>
+    </w:p>
+    <w:p>
+      <w:pPr>
+        <w:rPr>
+          <w:lang w:val="en-US"/>
+        </w:rPr>
+      </w:pPr>
+      <w:r>
+        <w:rPr>
+          <w:lang w:val="en-US"/>
+        </w:rPr>
+        <w:t>Third run:</w:t>
+      </w:r>
+    </w:p>
+    <w:p>
+      <w:pPr>
+        <w:rPr>
+          <w:lang w:val="en-US"/>
+        </w:rPr>
+      </w:pPr>
+      <w:r>
+        <w:rPr>
+          <w:noProof/>
+          <w:lang w:val="en-US"/>
+        </w:rPr>
+        <w:drawing>
+          <wp:inline distT="0" distB="0" distL="0" distR="0" wp14:anchorId="1B9FD115" wp14:editId="5D24D47D">
+            <wp:extent cx="5163271" cy="1171739"/>
+            <wp:effectExtent l="0" t="0" r="0" b="9525"/>
+            <wp:docPr id="8" name="Picture 8"/>
+            <wp:cNvGraphicFramePr>
+              <a:graphicFrameLocks xmlns:a="http://schemas.openxmlformats.org/drawingml/2006/main" noChangeAspect="1"/>
+            </wp:cNvGraphicFramePr>
+            <a:graphic xmlns:a="http://schemas.openxmlformats.org/drawingml/2006/main">
+              <a:graphicData uri="http://schemas.openxmlformats.org/drawingml/2006/picture">
+                <pic:pic xmlns:pic="http://schemas.openxmlformats.org/drawingml/2006/picture">
+                  <pic:nvPicPr>
+                    <pic:cNvPr id="1" name=""/>
+                    <pic:cNvPicPr/>
+                  </pic:nvPicPr>
+                  <pic:blipFill>
+                    <a:blip r:embed="rId14"/>
+                    <a:stretch>
+                      <a:fillRect/>
+                    </a:stretch>
+                  </pic:blipFill>
+                  <pic:spPr>
+                    <a:xfrm>
+                      <a:off x="0" y="0"/>
+                      <a:ext cx="5163271" cy="1171739"/>
+                    </a:xfrm>
+                    <a:prstGeom prst="rect">
+                      <a:avLst/>
+                    </a:prstGeom>
+                  </pic:spPr>
+                </pic:pic>
+              </a:graphicData>
+            </a:graphic>
+          </wp:inline>
+        </w:drawing>
+      </w:r>
+    </w:p>
+    <w:p>
+      <w:pPr>
+        <w:pStyle w:val="Quote"/>
+        <w:rPr>
+          <w:lang w:val="en-US"/>
+        </w:rPr>
+      </w:pPr>
+      <w:r>
+        <w:rPr>
+          <w:lang w:val="en-US"/>
+        </w:rPr>
+        <w:t>Description: 30 nodes, 3 layers, gamma 3*pi/8, beta 3*pi/3, samples 1500000</w:t>
+      </w:r>
+    </w:p>
+    <w:p>
+      <w:pPr>
+        <w:rPr>
+          <w:lang w:val="en-US"/>
+        </w:rPr>
+      </w:pPr>
+      <w:r>
+        <w:rPr>
+          <w:noProof/>
+          <w:lang w:val="en-US"/>
+        </w:rPr>
+        <w:lastRenderedPageBreak/>
+        <w:drawing>
+          <wp:inline distT="0" distB="0" distL="0" distR="0" wp14:anchorId="07AA0249" wp14:editId="20265DC6">
+            <wp:extent cx="4972744" cy="6077798"/>
+            <wp:effectExtent l="0" t="0" r="0" b="0"/>
+            <wp:docPr id="9" name="Picture 9"/>
+            <wp:cNvGraphicFramePr>
+              <a:graphicFrameLocks xmlns:a="http://schemas.openxmlformats.org/drawingml/2006/main" noChangeAspect="1"/>
+            </wp:cNvGraphicFramePr>
+            <a:graphic xmlns:a="http://schemas.openxmlformats.org/drawingml/2006/main">
+              <a:graphicData uri="http://schemas.openxmlformats.org/drawingml/2006/picture">
+                <pic:pic xmlns:pic="http://schemas.openxmlformats.org/drawingml/2006/picture">
+                  <pic:nvPicPr>
+                    <pic:cNvPr id="1" name=""/>
+                    <pic:cNvPicPr/>
+                  </pic:nvPicPr>
+                  <pic:blipFill>
+                    <a:blip r:embed="rId15"/>
+                    <a:stretch>
+                      <a:fillRect/>
+                    </a:stretch>
+                  </pic:blipFill>
+                  <pic:spPr>
+                    <a:xfrm>
+                      <a:off x="0" y="0"/>
+                      <a:ext cx="4972744" cy="6077798"/>
+                    </a:xfrm>
+                    <a:prstGeom prst="rect">
+                      <a:avLst/>
+                    </a:prstGeom>
+                  </pic:spPr>
+                </pic:pic>
+              </a:graphicData>
+            </a:graphic>
+          </wp:inline>
+        </w:drawing>
+      </w:r>
+    </w:p>
+    <w:p>
+      <w:pPr>
+        <w:pStyle w:val="Heading2"/>
+        <w:rPr>
+          <w:lang w:val="en-US"/>
+        </w:rPr>
+      </w:pPr>
+      <w:r>
+        <w:rPr>
+          <w:lang w:val="en-US"/>
+        </w:rPr>
+        <w:t>Optimization for the QSE</w:t>
+      </w:r>
+    </w:p>
+    <w:p>
+      <w:pPr>
+        <w:pStyle w:val="ListParagraph"/>
+        <w:numPr>
+          <w:ilvl w:val="0"/>
+          <w:numId w:val="15"/>
+        </w:numPr>
+        <w:rPr>
+          <w:lang w:val="en-US"/>
+        </w:rPr>
+      </w:pPr>
+      <w:r>
+        <w:rPr>
+          <w:lang w:val="en-US"/>
+        </w:rPr>
+        <w:t xml:space="preserve">Found that in </w:t>
+      </w:r>
+      <w:r>
+        <w:rPr>
+          <w:lang w:val="en-US"/>
+        </w:rPr>
+        <w:t xml:space="preserve">the </w:t>
+      </w:r>
+      <w:r>
+        <w:rPr>
+          <w:lang w:val="en-US"/>
+        </w:rPr>
+        <w:t>release version it goes faster)</w:t>
+      </w:r>
+    </w:p>
+    <w:p>
+      <w:pPr>
+        <w:pStyle w:val="ListParagraph"/>
+        <w:numPr>
+          <w:ilvl w:val="0"/>
+          <w:numId w:val="15"/>
+        </w:numPr>
+        <w:rPr>
+          <w:lang w:val="en-US"/>
+        </w:rPr>
+      </w:pPr>
+      <w:r>
+        <w:rPr>
+          <w:lang w:val="en-US"/>
+        </w:rPr>
+        <w:t>Change compiler to Intel NextGen</w:t>
+      </w:r>
+    </w:p>
+    <w:p>
+      <w:pPr>
+        <w:pStyle w:val="ListParagraph"/>
+        <w:numPr>
+          <w:ilvl w:val="0"/>
+          <w:numId w:val="15"/>
+        </w:numPr>
+        <w:rPr>
+          <w:lang w:val="en-US"/>
+        </w:rPr>
+      </w:pPr>
+      <w:r>
+        <w:rPr>
+          <w:lang w:val="en-US"/>
+        </w:rPr>
+        <w:t xml:space="preserve">Since we have all the states in </w:t>
+      </w:r>
+      <w:r>
+        <w:rPr>
+          <w:lang w:val="en-US"/>
+        </w:rPr>
+        <w:t>a state vector,</w:t>
+      </w:r>
+      <w:r>
+        <w:rPr>
+          <w:lang w:val="en-US"/>
+        </w:rPr>
+        <w:t xml:space="preserve"> we </w:t>
+      </w:r>
+      <w:r>
+        <w:rPr>
+          <w:lang w:val="en-US"/>
+        </w:rPr>
+        <w:t xml:space="preserve">do </w:t>
+      </w:r>
+      <w:r>
+        <w:rPr>
+          <w:lang w:val="en-US"/>
+        </w:rPr>
+        <w:t xml:space="preserve">not </w:t>
+      </w:r>
+      <w:r>
+        <w:rPr>
+          <w:lang w:val="en-US"/>
+        </w:rPr>
+        <w:t>collapse the</w:t>
+      </w:r>
+      <w:r>
+        <w:rPr>
+          <w:lang w:val="en-US"/>
+        </w:rPr>
+        <w:t xml:space="preserve"> vector to measure it</w:t>
+      </w:r>
+      <w:r>
+        <w:rPr>
+          <w:lang w:val="en-US"/>
+        </w:rPr>
+        <w:t>,</w:t>
+      </w:r>
+      <w:r>
+        <w:rPr>
+          <w:lang w:val="en-US"/>
+        </w:rPr>
+        <w:t xml:space="preserve"> but get samples. This allows us to run </w:t>
+      </w:r>
+      <w:r>
+        <w:rPr>
+          <w:lang w:val="en-US"/>
+        </w:rPr>
+        <w:t xml:space="preserve">the </w:t>
+      </w:r>
+      <w:r>
+        <w:rPr>
+          <w:lang w:val="en-US"/>
+        </w:rPr>
+        <w:t xml:space="preserve">circuit only </w:t>
+      </w:r>
+      <w:proofErr w:type="spellStart"/>
+      <w:proofErr w:type="gramStart"/>
+      <w:r>
+        <w:rPr>
+          <w:lang w:val="en-US"/>
+        </w:rPr>
+        <w:t>once</w:t>
+      </w:r>
+      <w:r>
+        <w:rPr>
+          <w:b/>
+          <w:bCs/>
+          <w:lang w:val="en-US"/>
+        </w:rPr>
+        <w:t>!</w:t>
+      </w:r>
+      <w:r>
+        <w:rPr>
+          <w:b/>
+          <w:bCs/>
+          <w:lang w:val="en-US"/>
+        </w:rPr>
+        <w:t>IMPORTANT</w:t>
+      </w:r>
+      <w:proofErr w:type="spellEnd"/>
+      <w:proofErr w:type="gramEnd"/>
+      <w:r>
+        <w:rPr>
+          <w:b/>
+          <w:bCs/>
+          <w:lang w:val="en-US"/>
+        </w:rPr>
+        <w:t>: This</w:t>
+      </w:r>
+      <w:r>
+        <w:rPr>
+          <w:b/>
+          <w:bCs/>
+          <w:lang w:val="en-US"/>
+        </w:rPr>
+        <w:t xml:space="preserve"> will not work with noise simulation</w:t>
+      </w:r>
+    </w:p>
+    <w:p>
+      <w:pPr>
+        <w:pStyle w:val="ListParagraph"/>
+        <w:numPr>
+          <w:ilvl w:val="0"/>
+          <w:numId w:val="15"/>
+        </w:numPr>
+        <w:rPr>
+          <w:lang w:val="en-US"/>
+        </w:rPr>
+      </w:pPr>
+      <w:r>
+        <w:rPr>
+          <w:lang w:val="en-US"/>
+        </w:rPr>
+        <w:t xml:space="preserve">Getting samples takes half memory as a Vector state, but I believe it is not a problem since vector </w:t>
+      </w:r>
+      <w:r>
+        <w:rPr>
+          <w:lang w:val="en-US"/>
+        </w:rPr>
+        <w:t xml:space="preserve">is </w:t>
+      </w:r>
+      <w:r>
+        <w:rPr>
+          <w:lang w:val="en-US"/>
+        </w:rPr>
+        <w:t xml:space="preserve">always slightly bigger than half of available memory (for example, for 30 qubits 17,2gb + 8,6gb for samples) so </w:t>
+      </w:r>
+      <w:r>
+        <w:rPr>
+          <w:lang w:val="en-US"/>
+        </w:rPr>
+        <w:t>in the</w:t>
+      </w:r>
+      <w:r>
+        <w:rPr>
+          <w:lang w:val="en-US"/>
+        </w:rPr>
+        <w:t xml:space="preserve"> worst case</w:t>
+      </w:r>
+      <w:r>
+        <w:rPr>
+          <w:lang w:val="en-US"/>
+        </w:rPr>
+        <w:t>,</w:t>
+      </w:r>
+      <w:r>
+        <w:rPr>
+          <w:lang w:val="en-US"/>
+        </w:rPr>
+        <w:t xml:space="preserve"> it will use slightly above ¾ </w:t>
+      </w:r>
+      <w:r>
+        <w:rPr>
+          <w:lang w:val="en-US"/>
+        </w:rPr>
+        <w:t xml:space="preserve">of </w:t>
+      </w:r>
+      <w:r>
+        <w:rPr>
+          <w:lang w:val="en-US"/>
+        </w:rPr>
+        <w:t>available memory.</w:t>
+      </w:r>
+    </w:p>
+    <w:p>
+      <w:pPr>
+        <w:pStyle w:val="ListParagraph"/>
+        <w:numPr>
+          <w:ilvl w:val="0"/>
+          <w:numId w:val="15"/>
+        </w:numPr>
+        <w:rPr>
+          <w:lang w:val="en-US"/>
+        </w:rPr>
+      </w:pPr>
+      <w:r>
+        <w:rPr>
+          <w:lang w:val="en-US"/>
+        </w:rPr>
+        <w:t>Current top performance:</w:t>
+      </w:r>
+    </w:p>
+    <w:p>
+      <w:pPr>
+        <w:pStyle w:val="ListParagraph"/>
+        <w:rPr>
+          <w:lang w:val="en-US"/>
+        </w:rPr>
+      </w:pPr>
+      <w:r>
+        <w:rPr>
+          <w:noProof/>
+          <w:lang w:val="en-US"/>
+        </w:rPr>
+        <w:lastRenderedPageBreak/>
+        <w:drawing>
+          <wp:inline distT="0" distB="0" distL="0" distR="0" wp14:anchorId="7E2BF951" wp14:editId="7808A2AA">
+            <wp:extent cx="3991532" cy="2229161"/>
+            <wp:effectExtent l="0" t="0" r="9525" b="0"/>
+            <wp:docPr id="5" name="Picture 5"/>
+            <wp:cNvGraphicFramePr>
+              <a:graphicFrameLocks xmlns:a="http://schemas.openxmlformats.org/drawingml/2006/main" noChangeAspect="1"/>
+            </wp:cNvGraphicFramePr>
+            <a:graphic xmlns:a="http://schemas.openxmlformats.org/drawingml/2006/main">
+              <a:graphicData uri="http://schemas.openxmlformats.org/drawingml/2006/picture">
+                <pic:pic xmlns:pic="http://schemas.openxmlformats.org/drawingml/2006/picture">
+                  <pic:nvPicPr>
+                    <pic:cNvPr id="1" name=""/>
+                    <pic:cNvPicPr/>
+                  </pic:nvPicPr>
+                  <pic:blipFill>
+                    <a:blip r:embed="rId16"/>
+                    <a:stretch>
+                      <a:fillRect/>
+                    </a:stretch>
+                  </pic:blipFill>
+                  <pic:spPr>
+                    <a:xfrm>
+                      <a:off x="0" y="0"/>
+                      <a:ext cx="3991532" cy="2229161"/>
+                    </a:xfrm>
+                    <a:prstGeom prst="rect">
+                      <a:avLst/>
+                    </a:prstGeom>
+                  </pic:spPr>
+                </pic:pic>
+              </a:graphicData>
+            </a:graphic>
+          </wp:inline>
+        </w:drawing>
+      </w:r>
+    </w:p>
+    <w:p>
+      <w:pPr>
+        <w:rPr>
+          <w:lang w:val="en-US"/>
+        </w:rPr>
+      </w:pPr>
+      <w:r>
+        <w:rPr>
+          <w:lang w:val="en-US"/>
+        </w:rPr>
+        <w:t>Grover</w:t>
+      </w:r>
+    </w:p>
+    <w:p>
+      <w:pPr>
+        <w:rPr>
+          <w:lang w:val="en-US"/>
+        </w:rPr>
+      </w:pPr>
+      <w:r>
+        <w:rPr>
+          <w:lang w:val="en-US"/>
+        </w:rPr>
+        <w:drawing>
+          <wp:inline distT="0" distB="0" distL="0" distR="0" wp14:anchorId="4564B133" wp14:editId="42EECB5E">
+            <wp:extent cx="5706271" cy="1781424"/>
+            <wp:effectExtent l="0" t="0" r="0" b="9525"/>
+            <wp:docPr id="10" name="Picture 10"/>
+            <wp:cNvGraphicFramePr>
+              <a:graphicFrameLocks xmlns:a="http://schemas.openxmlformats.org/drawingml/2006/main" noChangeAspect="1"/>
+            </wp:cNvGraphicFramePr>
+            <a:graphic xmlns:a="http://schemas.openxmlformats.org/drawingml/2006/main">
+              <a:graphicData uri="http://schemas.openxmlformats.org/drawingml/2006/picture">
+                <pic:pic xmlns:pic="http://schemas.openxmlformats.org/drawingml/2006/picture">
+                  <pic:nvPicPr>
+                    <pic:cNvPr id="1" name=""/>
+                    <pic:cNvPicPr/>
+                  </pic:nvPicPr>
+                  <pic:blipFill>
+                    <a:blip r:embed="rId17"/>
+                    <a:stretch>
+                      <a:fillRect/>
+                    </a:stretch>
+                  </pic:blipFill>
+                  <pic:spPr>
+                    <a:xfrm>
+                      <a:off x="0" y="0"/>
+                      <a:ext cx="5706271" cy="1781424"/>
+                    </a:xfrm>
+                    <a:prstGeom prst="rect">
+                      <a:avLst/>
+                    </a:prstGeom>
+                  </pic:spPr>
+                </pic:pic>
+              </a:graphicData>
+            </a:graphic>
+          </wp:inline>
+        </w:drawing>
       </w:r>
     </w:p>
     <w:sectPr>
@@ -4012,6 +4705,119 @@
     </w:lvl>
   </w:abstractNum>
   <w:abstractNum w:abstractNumId="13" w15:restartNumberingAfterBreak="0">
+    <w:nsid w:val="7DF037A2"/>
+    <w:multiLevelType w:val="hybridMultilevel"/>
+    <w:tmpl w:val="FE1AC82C"/>
+    <w:lvl w:ilvl="0" w:tplc="20000001">
+      <w:start w:val="1"/>
+      <w:numFmt w:val="bullet"/>
+      <w:lvlText w:val=""/>
+      <w:lvlJc w:val="left"/>
+      <w:pPr>
+        <w:ind w:left="720" w:hanging="360"/>
+      </w:pPr>
+      <w:rPr>
+        <w:rFonts w:ascii="Symbol" w:hAnsi="Symbol" w:hint="default"/>
+      </w:rPr>
+    </w:lvl>
+    <w:lvl w:ilvl="1" w:tplc="20000003" w:tentative="1">
+      <w:start w:val="1"/>
+      <w:numFmt w:val="bullet"/>
+      <w:lvlText w:val="o"/>
+      <w:lvlJc w:val="left"/>
+      <w:pPr>
+        <w:ind w:left="1440" w:hanging="360"/>
+      </w:pPr>
+      <w:rPr>
+        <w:rFonts w:ascii="Courier New" w:hAnsi="Courier New" w:cs="Courier New" w:hint="default"/>
+      </w:rPr>
+    </w:lvl>
+    <w:lvl w:ilvl="2" w:tplc="20000005" w:tentative="1">
+      <w:start w:val="1"/>
+      <w:numFmt w:val="bullet"/>
+      <w:lvlText w:val=""/>
+      <w:lvlJc w:val="left"/>
+      <w:pPr>
+        <w:ind w:left="2160" w:hanging="360"/>
+      </w:pPr>
+      <w:rPr>
+        <w:rFonts w:ascii="Wingdings" w:hAnsi="Wingdings" w:hint="default"/>
+      </w:rPr>
+    </w:lvl>
+    <w:lvl w:ilvl="3" w:tplc="20000001" w:tentative="1">
+      <w:start w:val="1"/>
+      <w:numFmt w:val="bullet"/>
+      <w:lvlText w:val=""/>
+      <w:lvlJc w:val="left"/>
+      <w:pPr>
+        <w:ind w:left="2880" w:hanging="360"/>
+      </w:pPr>
+      <w:rPr>
+        <w:rFonts w:ascii="Symbol" w:hAnsi="Symbol" w:hint="default"/>
+      </w:rPr>
+    </w:lvl>
+    <w:lvl w:ilvl="4" w:tplc="20000003" w:tentative="1">
+      <w:start w:val="1"/>
+      <w:numFmt w:val="bullet"/>
+      <w:lvlText w:val="o"/>
+      <w:lvlJc w:val="left"/>
+      <w:pPr>
+        <w:ind w:left="3600" w:hanging="360"/>
+      </w:pPr>
+      <w:rPr>
+        <w:rFonts w:ascii="Courier New" w:hAnsi="Courier New" w:cs="Courier New" w:hint="default"/>
+      </w:rPr>
+    </w:lvl>
+    <w:lvl w:ilvl="5" w:tplc="20000005" w:tentative="1">
+      <w:start w:val="1"/>
+      <w:numFmt w:val="bullet"/>
+      <w:lvlText w:val=""/>
+      <w:lvlJc w:val="left"/>
+      <w:pPr>
+        <w:ind w:left="4320" w:hanging="360"/>
+      </w:pPr>
+      <w:rPr>
+        <w:rFonts w:ascii="Wingdings" w:hAnsi="Wingdings" w:hint="default"/>
+      </w:rPr>
+    </w:lvl>
+    <w:lvl w:ilvl="6" w:tplc="20000001" w:tentative="1">
+      <w:start w:val="1"/>
+      <w:numFmt w:val="bullet"/>
+      <w:lvlText w:val=""/>
+      <w:lvlJc w:val="left"/>
+      <w:pPr>
+        <w:ind w:left="5040" w:hanging="360"/>
+      </w:pPr>
+      <w:rPr>
+        <w:rFonts w:ascii="Symbol" w:hAnsi="Symbol" w:hint="default"/>
+      </w:rPr>
+    </w:lvl>
+    <w:lvl w:ilvl="7" w:tplc="20000003" w:tentative="1">
+      <w:start w:val="1"/>
+      <w:numFmt w:val="bullet"/>
+      <w:lvlText w:val="o"/>
+      <w:lvlJc w:val="left"/>
+      <w:pPr>
+        <w:ind w:left="5760" w:hanging="360"/>
+      </w:pPr>
+      <w:rPr>
+        <w:rFonts w:ascii="Courier New" w:hAnsi="Courier New" w:cs="Courier New" w:hint="default"/>
+      </w:rPr>
+    </w:lvl>
+    <w:lvl w:ilvl="8" w:tplc="20000005" w:tentative="1">
+      <w:start w:val="1"/>
+      <w:numFmt w:val="bullet"/>
+      <w:lvlText w:val=""/>
+      <w:lvlJc w:val="left"/>
+      <w:pPr>
+        <w:ind w:left="6480" w:hanging="360"/>
+      </w:pPr>
+      <w:rPr>
+        <w:rFonts w:ascii="Wingdings" w:hAnsi="Wingdings" w:hint="default"/>
+      </w:rPr>
+    </w:lvl>
+  </w:abstractNum>
+  <w:abstractNum w:abstractNumId="14" w15:restartNumberingAfterBreak="0">
     <w:nsid w:val="7E8C1E4A"/>
     <w:multiLevelType w:val="hybridMultilevel"/>
     <w:tmpl w:val="411C4C4A"/>
@@ -4134,7 +4940,7 @@
     <w:abstractNumId w:val="10"/>
   </w:num>
   <w:num w:numId="4">
-    <w:abstractNumId w:val="13"/>
+    <w:abstractNumId w:val="14"/>
   </w:num>
   <w:num w:numId="5">
     <w:abstractNumId w:val="4"/>
@@ -4165,6 +4971,9 @@
   </w:num>
   <w:num w:numId="14">
     <w:abstractNumId w:val="1"/>
+  </w:num>
+  <w:num w:numId="15">
+    <w:abstractNumId w:val="13"/>
   </w:num>
 </w:numbering>
 </file>
@@ -4717,6 +5526,37 @@
       <w:shd w:val="clear" w:color="auto" w:fill="E1DFDD"/>
     </w:rPr>
   </w:style>
+  <w:style w:type="paragraph" w:styleId="Quote">
+    <w:name w:val="Quote"/>
+    <w:basedOn w:val="Normal"/>
+    <w:next w:val="Normal"/>
+    <w:link w:val="QuoteChar"/>
+    <w:uiPriority w:val="29"/>
+    <w:qFormat/>
+    <w:rsid w:val="00140B4A"/>
+    <w:pPr>
+      <w:spacing w:before="200"/>
+      <w:ind w:left="864" w:right="864"/>
+      <w:jc w:val="center"/>
+    </w:pPr>
+    <w:rPr>
+      <w:i/>
+      <w:iCs/>
+      <w:color w:val="404040" w:themeColor="text1" w:themeTint="BF"/>
+    </w:rPr>
+  </w:style>
+  <w:style w:type="character" w:customStyle="1" w:styleId="QuoteChar">
+    <w:name w:val="Quote Char"/>
+    <w:basedOn w:val="DefaultParagraphFont"/>
+    <w:link w:val="Quote"/>
+    <w:uiPriority w:val="29"/>
+    <w:rsid w:val="00140B4A"/>
+    <w:rPr>
+      <w:i/>
+      <w:iCs/>
+      <w:color w:val="404040" w:themeColor="text1" w:themeTint="BF"/>
+    </w:rPr>
+  </w:style>
 </w:styles>
 </file>
 

</xml_diff>